<commit_message>
Site updated: 2022-06-15 21:28:36
</commit_message>
<xml_diff>
--- a/treasure/download/杂藏-139部/史传部-96部/新建文件夹/大唐西域记-唐-玄奘.docx
+++ b/treasure/download/杂藏-139部/史传部-96部/新建文件夹/大唐西域记-唐-玄奘.docx
@@ -32,7 +32,6 @@
           <w:shd w:val="pct15" w:color="auto" w:fill="FFFFFF"/>
         </w:rPr>
       </w:pPr>
-      <w:bookmarkStart w:id="0" w:name="_GoBack"/>
       <w:r>
         <w:rPr>
           <w:rFonts w:ascii="楷体" w:eastAsia="楷体" w:hAnsi="楷体" w:hint="eastAsia"/>
@@ -43,7 +42,6 @@
         <w:t>唐三藏法师玄奘奉诏</w:t>
       </w:r>
     </w:p>
-    <w:bookmarkEnd w:id="0"/>
     <w:p>
       <w:pPr>
         <w:jc w:val="center"/>
@@ -7194,17 +7192,136 @@
           <w:szCs w:val="24"/>
           <w:shd w:val="pct15" w:color="auto" w:fill="FFFFFF"/>
         </w:rPr>
-        <w:t xml:space="preserve">　　释梵窣堵波前。是莲华色苾刍尼欲先见佛化作转轮王处。如来自天宫还赡部洲也。时苏部底</w:t>
-      </w:r>
-      <w:r>
-        <w:rPr>
-          <w:rFonts w:ascii="楷体" w:eastAsia="楷体" w:hAnsi="楷体"/>
-          <w:sz w:val="24"/>
-          <w:szCs w:val="24"/>
-          <w:shd w:val="pct15" w:color="auto" w:fill="FFFFFF"/>
-        </w:rPr>
-        <w:t>(唐言善现。旧曰须扶提。或曰须菩提。译曰善吉。皆讹也)宴坐石室。窃自思曰。今佛还降人天导从。如我今者何所宜行。尝闻佛说。知诸法空体诸法性。是则以慧眼观法身也。时莲华色苾刍尼欲初见佛。化为转轮王。七宝导从四兵警卫。至世尊所复。苾刍尼。如来告曰。汝非初见。夫善现者观诸法空是见法身。</w:t>
-      </w:r>
+        <w:t xml:space="preserve">　　</w:t>
+      </w:r>
+      <w:bookmarkStart w:id="0" w:name="_GoBack"/>
+      <w:r>
+        <w:rPr>
+          <w:rFonts w:ascii="楷体" w:eastAsia="楷体" w:hAnsi="楷体" w:hint="eastAsia"/>
+          <w:sz w:val="24"/>
+          <w:szCs w:val="24"/>
+          <w:shd w:val="pct15" w:color="auto" w:fill="FFFFFF"/>
+        </w:rPr>
+        <w:t>释梵窣堵波前。是莲华色苾刍尼欲先见佛化作转轮王处。如来自天宫还赡部洲也。时苏部底</w:t>
+      </w:r>
+      <w:r>
+        <w:rPr>
+          <w:rFonts w:ascii="楷体" w:eastAsia="楷体" w:hAnsi="楷体"/>
+          <w:sz w:val="24"/>
+          <w:szCs w:val="24"/>
+          <w:shd w:val="pct15" w:color="auto" w:fill="FFFFFF"/>
+        </w:rPr>
+        <w:t>(唐言善现。旧曰须扶提。或曰须菩提。译曰善吉。皆讹也)宴坐石室。窃自思曰。今佛还降</w:t>
+      </w:r>
+      <w:r>
+        <w:rPr>
+          <w:rFonts w:ascii="楷体" w:eastAsia="楷体" w:hAnsi="楷体" w:hint="eastAsia"/>
+          <w:sz w:val="24"/>
+          <w:szCs w:val="24"/>
+          <w:shd w:val="pct15" w:color="auto" w:fill="FFFFFF"/>
+        </w:rPr>
+        <w:t>。</w:t>
+      </w:r>
+      <w:r>
+        <w:rPr>
+          <w:rFonts w:ascii="楷体" w:eastAsia="楷体" w:hAnsi="楷体"/>
+          <w:sz w:val="24"/>
+          <w:szCs w:val="24"/>
+          <w:shd w:val="pct15" w:color="auto" w:fill="FFFFFF"/>
+        </w:rPr>
+        <w:t>人天导从。如我今者何所宜行。尝闻佛说。知诸法空</w:t>
+      </w:r>
+      <w:r>
+        <w:rPr>
+          <w:rFonts w:ascii="楷体" w:eastAsia="楷体" w:hAnsi="楷体" w:hint="eastAsia"/>
+          <w:sz w:val="24"/>
+          <w:szCs w:val="24"/>
+          <w:shd w:val="pct15" w:color="auto" w:fill="FFFFFF"/>
+        </w:rPr>
+        <w:t>。</w:t>
+      </w:r>
+      <w:r>
+        <w:rPr>
+          <w:rFonts w:ascii="楷体" w:eastAsia="楷体" w:hAnsi="楷体"/>
+          <w:sz w:val="24"/>
+          <w:szCs w:val="24"/>
+          <w:shd w:val="pct15" w:color="auto" w:fill="FFFFFF"/>
+        </w:rPr>
+        <w:t>体诸法性。是则以慧眼观法身也。时</w:t>
+      </w:r>
+      <w:r>
+        <w:rPr>
+          <w:rFonts w:ascii="楷体" w:eastAsia="楷体" w:hAnsi="楷体"/>
+          <w:sz w:val="24"/>
+          <w:szCs w:val="24"/>
+          <w:shd w:val="pct15" w:color="auto" w:fill="FFFFFF"/>
+        </w:rPr>
+        <w:t>莲华色苾刍尼欲初见佛。化为转轮王。七宝导从四兵警卫。至世尊所</w:t>
+      </w:r>
+      <w:r>
+        <w:rPr>
+          <w:rFonts w:ascii="楷体" w:eastAsia="楷体" w:hAnsi="楷体" w:hint="eastAsia"/>
+          <w:sz w:val="24"/>
+          <w:szCs w:val="24"/>
+          <w:shd w:val="pct15" w:color="auto" w:fill="FFFFFF"/>
+        </w:rPr>
+        <w:t>。</w:t>
+      </w:r>
+      <w:r>
+        <w:rPr>
+          <w:rFonts w:ascii="楷体" w:eastAsia="楷体" w:hAnsi="楷体"/>
+          <w:sz w:val="24"/>
+          <w:szCs w:val="24"/>
+          <w:shd w:val="pct15" w:color="auto" w:fill="FFFFFF"/>
+        </w:rPr>
+        <w:t>复</w:t>
+      </w:r>
+      <w:r>
+        <w:rPr>
+          <w:rFonts w:ascii="楷体" w:eastAsia="楷体" w:hAnsi="楷体"/>
+          <w:sz w:val="24"/>
+          <w:szCs w:val="24"/>
+          <w:shd w:val="pct15" w:color="auto" w:fill="FFFFFF"/>
+        </w:rPr>
+        <w:t>苾刍尼。如来告曰。汝非初见。夫善现者</w:t>
+      </w:r>
+      <w:r>
+        <w:rPr>
+          <w:rFonts w:ascii="楷体" w:eastAsia="楷体" w:hAnsi="楷体" w:hint="eastAsia"/>
+          <w:sz w:val="24"/>
+          <w:szCs w:val="24"/>
+          <w:shd w:val="pct15" w:color="auto" w:fill="FFFFFF"/>
+        </w:rPr>
+        <w:t>。</w:t>
+      </w:r>
+      <w:r>
+        <w:rPr>
+          <w:rFonts w:ascii="楷体" w:eastAsia="楷体" w:hAnsi="楷体"/>
+          <w:sz w:val="24"/>
+          <w:szCs w:val="24"/>
+          <w:shd w:val="pct15" w:color="auto" w:fill="FFFFFF"/>
+        </w:rPr>
+        <w:t>观诸法空</w:t>
+      </w:r>
+      <w:r>
+        <w:rPr>
+          <w:rFonts w:ascii="楷体" w:eastAsia="楷体" w:hAnsi="楷体" w:hint="eastAsia"/>
+          <w:sz w:val="24"/>
+          <w:szCs w:val="24"/>
+          <w:shd w:val="pct15" w:color="auto" w:fill="FFFFFF"/>
+        </w:rPr>
+        <w:t>。</w:t>
+      </w:r>
+      <w:r>
+        <w:rPr>
+          <w:rFonts w:ascii="楷体" w:eastAsia="楷体" w:hAnsi="楷体"/>
+          <w:sz w:val="24"/>
+          <w:szCs w:val="24"/>
+          <w:shd w:val="pct15" w:color="auto" w:fill="FFFFFF"/>
+        </w:rPr>
+        <w:t>是见法身。</w:t>
+      </w:r>
+      <w:bookmarkEnd w:id="0"/>
     </w:p>
     <w:p>
       <w:pPr>
@@ -17879,6 +17996,44 @@
     </w:sectPr>
   </w:body>
 </w:document>
+</file>
+
+<file path=word/endnotes.xml><?xml version="1.0" encoding="utf-8"?>
+<w:endnotes xmlns:wpc="http://schemas.microsoft.com/office/word/2010/wordprocessingCanvas" xmlns:cx="http://schemas.microsoft.com/office/drawing/2014/chartex" xmlns:mc="http://schemas.openxmlformats.org/markup-compatibility/2006" xmlns:o="urn:schemas-microsoft-com:office:office" xmlns:r="http://schemas.openxmlformats.org/officeDocument/2006/relationships" xmlns:m="http://schemas.openxmlformats.org/officeDocument/2006/math" xmlns:v="urn:schemas-microsoft-com:vml" xmlns:wp14="http://schemas.microsoft.com/office/word/2010/wordprocessingDrawing" xmlns:wp="http://schemas.openxmlformats.org/drawingml/2006/wordprocessingDrawing" xmlns:w10="urn:schemas-microsoft-com:office:word" xmlns:w="http://schemas.openxmlformats.org/wordprocessingml/2006/main" xmlns:w14="http://schemas.microsoft.com/office/word/2010/wordml" xmlns:w15="http://schemas.microsoft.com/office/word/2012/wordml" xmlns:w16se="http://schemas.microsoft.com/office/word/2015/wordml/symex" xmlns:wpg="http://schemas.microsoft.com/office/word/2010/wordprocessingGroup" xmlns:wpi="http://schemas.microsoft.com/office/word/2010/wordprocessingInk" xmlns:wne="http://schemas.microsoft.com/office/word/2006/wordml" xmlns:wps="http://schemas.microsoft.com/office/word/2010/wordprocessingShape" mc:Ignorable="w14 w15 w16se wp14">
+  <w:endnote w:type="separator" w:id="-1">
+    <w:p>
+      <w:r>
+        <w:separator/>
+      </w:r>
+    </w:p>
+  </w:endnote>
+  <w:endnote w:type="continuationSeparator" w:id="0">
+    <w:p>
+      <w:r>
+        <w:continuationSeparator/>
+      </w:r>
+    </w:p>
+  </w:endnote>
+</w:endnotes>
+</file>
+
+<file path=word/footnotes.xml><?xml version="1.0" encoding="utf-8"?>
+<w:footnotes xmlns:wpc="http://schemas.microsoft.com/office/word/2010/wordprocessingCanvas" xmlns:cx="http://schemas.microsoft.com/office/drawing/2014/chartex" xmlns:mc="http://schemas.openxmlformats.org/markup-compatibility/2006" xmlns:o="urn:schemas-microsoft-com:office:office" xmlns:r="http://schemas.openxmlformats.org/officeDocument/2006/relationships" xmlns:m="http://schemas.openxmlformats.org/officeDocument/2006/math" xmlns:v="urn:schemas-microsoft-com:vml" xmlns:wp14="http://schemas.microsoft.com/office/word/2010/wordprocessingDrawing" xmlns:wp="http://schemas.openxmlformats.org/drawingml/2006/wordprocessingDrawing" xmlns:w10="urn:schemas-microsoft-com:office:word" xmlns:w="http://schemas.openxmlformats.org/wordprocessingml/2006/main" xmlns:w14="http://schemas.microsoft.com/office/word/2010/wordml" xmlns:w15="http://schemas.microsoft.com/office/word/2012/wordml" xmlns:w16se="http://schemas.microsoft.com/office/word/2015/wordml/symex" xmlns:wpg="http://schemas.microsoft.com/office/word/2010/wordprocessingGroup" xmlns:wpi="http://schemas.microsoft.com/office/word/2010/wordprocessingInk" xmlns:wne="http://schemas.microsoft.com/office/word/2006/wordml" xmlns:wps="http://schemas.microsoft.com/office/word/2010/wordprocessingShape" mc:Ignorable="w14 w15 w16se wp14">
+  <w:footnote w:type="separator" w:id="-1">
+    <w:p>
+      <w:r>
+        <w:separator/>
+      </w:r>
+    </w:p>
+  </w:footnote>
+  <w:footnote w:type="continuationSeparator" w:id="0">
+    <w:p>
+      <w:r>
+        <w:continuationSeparator/>
+      </w:r>
+    </w:p>
+  </w:footnote>
+</w:footnotes>
 </file>
 
 <file path=word/styles.xml><?xml version="1.0" encoding="utf-8"?>
@@ -18303,6 +18458,71 @@
     <w:semiHidden/>
     <w:unhideWhenUsed/>
   </w:style>
+  <w:style w:type="paragraph" w:styleId="a3">
+    <w:name w:val="header"/>
+    <w:basedOn w:val="a"/>
+    <w:link w:val="a4"/>
+    <w:uiPriority w:val="99"/>
+    <w:unhideWhenUsed/>
+    <w:rsid w:val="002F18AE"/>
+    <w:pPr>
+      <w:pBdr>
+        <w:bottom w:val="single" w:sz="6" w:space="1" w:color="auto"/>
+      </w:pBdr>
+      <w:tabs>
+        <w:tab w:val="center" w:pos="4153"/>
+        <w:tab w:val="right" w:pos="8306"/>
+      </w:tabs>
+      <w:snapToGrid w:val="0"/>
+      <w:jc w:val="center"/>
+    </w:pPr>
+    <w:rPr>
+      <w:sz w:val="18"/>
+      <w:szCs w:val="18"/>
+    </w:rPr>
+  </w:style>
+  <w:style w:type="character" w:customStyle="1" w:styleId="a4">
+    <w:name w:val="页眉 字符"/>
+    <w:basedOn w:val="a0"/>
+    <w:link w:val="a3"/>
+    <w:uiPriority w:val="99"/>
+    <w:rsid w:val="002F18AE"/>
+    <w:rPr>
+      <w:sz w:val="18"/>
+      <w:szCs w:val="18"/>
+    </w:rPr>
+  </w:style>
+  <w:style w:type="paragraph" w:styleId="a5">
+    <w:name w:val="footer"/>
+    <w:basedOn w:val="a"/>
+    <w:link w:val="a6"/>
+    <w:uiPriority w:val="99"/>
+    <w:unhideWhenUsed/>
+    <w:rsid w:val="002F18AE"/>
+    <w:pPr>
+      <w:tabs>
+        <w:tab w:val="center" w:pos="4153"/>
+        <w:tab w:val="right" w:pos="8306"/>
+      </w:tabs>
+      <w:snapToGrid w:val="0"/>
+      <w:jc w:val="left"/>
+    </w:pPr>
+    <w:rPr>
+      <w:sz w:val="18"/>
+      <w:szCs w:val="18"/>
+    </w:rPr>
+  </w:style>
+  <w:style w:type="character" w:customStyle="1" w:styleId="a6">
+    <w:name w:val="页脚 字符"/>
+    <w:basedOn w:val="a0"/>
+    <w:link w:val="a5"/>
+    <w:uiPriority w:val="99"/>
+    <w:rsid w:val="002F18AE"/>
+    <w:rPr>
+      <w:sz w:val="18"/>
+      <w:szCs w:val="18"/>
+    </w:rPr>
+  </w:style>
 </w:styles>
 </file>
 

</xml_diff>